<commit_message>
Implement main character selection menu (Gopher vs Rust) with customized inventory capacities and starting items
</commit_message>
<xml_diff>
--- a/report/character_designer/25-07-2026.docx
+++ b/report/character_designer/25-07-2026.docx
@@ -42,7 +42,7 @@
         <w:t xml:space="preserve">Verification Date: </w:t>
       </w:r>
       <w:r>
-        <w:t>25-07-2026 00:03:58 (ICT - Asia/Bangkok)</w:t>
+        <w:t>25-07-2026 00:10:29 (ICT - Asia/Bangkok)</w:t>
         <w:br/>
       </w:r>
       <w:r>
@@ -227,7 +227,7 @@
           </w:tcPr>
           <w:p>
             <w:r>
-              <w:t>95.0%</w:t>
+              <w:t>4.9%</w:t>
             </w:r>
           </w:p>
         </w:tc>
@@ -249,7 +249,7 @@
           </w:tcPr>
           <w:p>
             <w:r>
-              <w:t>21.48 GB / 23.71 GB</w:t>
+              <w:t>20.83 GB / 23.71 GB</w:t>
             </w:r>
           </w:p>
         </w:tc>
@@ -259,7 +259,7 @@
           </w:tcPr>
           <w:p>
             <w:r>
-              <w:t>90.6%</w:t>
+              <w:t>87.9%</w:t>
             </w:r>
           </w:p>
         </w:tc>
@@ -281,7 +281,7 @@
           </w:tcPr>
           <w:p>
             <w:r>
-              <w:t>391.96 GB / 1862.96 GB</w:t>
+              <w:t>391.97 GB / 1862.96 GB</w:t>
             </w:r>
           </w:p>
         </w:tc>
@@ -970,6 +970,42 @@
           </w:p>
         </w:tc>
       </w:tr>
+      <w:tr>
+        <w:tc>
+          <w:tcPr>
+            <w:tcW w:type="dxa" w:w="3120"/>
+          </w:tcPr>
+          <w:p>
+            <w:r>
+              <w:t>TestCharacterSelection</w:t>
+            </w:r>
+          </w:p>
+        </w:tc>
+        <w:tc>
+          <w:tcPr>
+            <w:tcW w:type="dxa" w:w="3120"/>
+          </w:tcPr>
+          <w:p>
+            <w:r>
+              <w:rPr>
+                <w:b/>
+                <w:color w:val="007800"/>
+              </w:rPr>
+              <w:t>PASS</w:t>
+            </w:r>
+          </w:p>
+        </w:tc>
+        <w:tc>
+          <w:tcPr>
+            <w:tcW w:type="dxa" w:w="3120"/>
+          </w:tcPr>
+          <w:p>
+            <w:r>
+              <w:t>0.00s</w:t>
+            </w:r>
+          </w:p>
+        </w:tc>
+      </w:tr>
     </w:tbl>
     <w:p/>
     <w:p>
@@ -1091,13 +1127,17 @@
         <w:br/>
         <w:t>--- PASS: TestDiagonalSlidingCollision (0.00s)</w:t>
         <w:br/>
+        <w:t>=== RUN   TestCharacterSelection</w:t>
+        <w:br/>
+        <w:t>--- PASS: TestCharacterSelection (0.00s)</w:t>
+        <w:br/>
         <w:t>PASS</w:t>
         <w:br/>
         <w:t xml:space="preserve">ok  </w:t>
         <w:tab/>
         <w:t>github.com/soulchip/game/internal/game</w:t>
         <w:tab/>
-        <w:t>0.729s</w:t>
+        <w:t>0.979s</w:t>
         <w:br/>
       </w:r>
     </w:p>

</xml_diff>

<commit_message>
Optimize performance monitor warmup ticks threshold to 300 to avoid false-positive startup alerts
</commit_message>
<xml_diff>
--- a/report/character_designer/25-07-2026.docx
+++ b/report/character_designer/25-07-2026.docx
@@ -42,7 +42,7 @@
         <w:t xml:space="preserve">Verification Date: </w:t>
       </w:r>
       <w:r>
-        <w:t>25-07-2026 00:10:29 (ICT - Asia/Bangkok)</w:t>
+        <w:t>25-07-2026 00:11:34 (ICT - Asia/Bangkok)</w:t>
         <w:br/>
       </w:r>
       <w:r>
@@ -227,7 +227,7 @@
           </w:tcPr>
           <w:p>
             <w:r>
-              <w:t>4.9%</w:t>
+              <w:t>3.9%</w:t>
             </w:r>
           </w:p>
         </w:tc>
@@ -249,7 +249,7 @@
           </w:tcPr>
           <w:p>
             <w:r>
-              <w:t>20.83 GB / 23.71 GB</w:t>
+              <w:t>20.81 GB / 23.71 GB</w:t>
             </w:r>
           </w:p>
         </w:tc>
@@ -259,7 +259,7 @@
           </w:tcPr>
           <w:p>
             <w:r>
-              <w:t>87.9%</w:t>
+              <w:t>87.7%</w:t>
             </w:r>
           </w:p>
         </w:tc>
@@ -1137,7 +1137,7 @@
         <w:tab/>
         <w:t>github.com/soulchip/game/internal/game</w:t>
         <w:tab/>
-        <w:t>0.979s</w:t>
+        <w:t>(cached)</w:t>
         <w:br/>
       </w:r>
     </w:p>

</xml_diff>

<commit_message>
Implement Main Menu with options for New Game, Settings, and Quit, with full settings submenu support
</commit_message>
<xml_diff>
--- a/report/character_designer/25-07-2026.docx
+++ b/report/character_designer/25-07-2026.docx
@@ -42,7 +42,7 @@
         <w:t xml:space="preserve">Verification Date: </w:t>
       </w:r>
       <w:r>
-        <w:t>25-07-2026 00:11:34 (ICT - Asia/Bangkok)</w:t>
+        <w:t>25-07-2026 00:15:59 (ICT - Asia/Bangkok)</w:t>
         <w:br/>
       </w:r>
       <w:r>
@@ -227,7 +227,7 @@
           </w:tcPr>
           <w:p>
             <w:r>
-              <w:t>3.9%</w:t>
+              <w:t>3.6%</w:t>
             </w:r>
           </w:p>
         </w:tc>
@@ -249,7 +249,7 @@
           </w:tcPr>
           <w:p>
             <w:r>
-              <w:t>20.81 GB / 23.71 GB</w:t>
+              <w:t>21.10 GB / 23.71 GB</w:t>
             </w:r>
           </w:p>
         </w:tc>
@@ -259,7 +259,7 @@
           </w:tcPr>
           <w:p>
             <w:r>
-              <w:t>87.7%</w:t>
+              <w:t>89.0%</w:t>
             </w:r>
           </w:p>
         </w:tc>
@@ -1137,7 +1137,7 @@
         <w:tab/>
         <w:t>github.com/soulchip/game/internal/game</w:t>
         <w:tab/>
-        <w:t>(cached)</w:t>
+        <w:t>1.817s</w:t>
         <w:br/>
       </w:r>
     </w:p>

</xml_diff>

<commit_message>
Design and implement Spencer Mansion 1F to 4F map layouts inspired by Resident Evil 1 Remake architectural flow
</commit_message>
<xml_diff>
--- a/report/character_designer/25-07-2026.docx
+++ b/report/character_designer/25-07-2026.docx
@@ -42,7 +42,7 @@
         <w:t xml:space="preserve">Verification Date: </w:t>
       </w:r>
       <w:r>
-        <w:t>25-07-2026 00:15:59 (ICT - Asia/Bangkok)</w:t>
+        <w:t>25-07-2026 00:18:28 (ICT - Asia/Bangkok)</w:t>
         <w:br/>
       </w:r>
       <w:r>
@@ -227,7 +227,7 @@
           </w:tcPr>
           <w:p>
             <w:r>
-              <w:t>3.6%</w:t>
+              <w:t>54.5%</w:t>
             </w:r>
           </w:p>
         </w:tc>
@@ -249,7 +249,7 @@
           </w:tcPr>
           <w:p>
             <w:r>
-              <w:t>21.10 GB / 23.71 GB</w:t>
+              <w:t>21.05 GB / 23.71 GB</w:t>
             </w:r>
           </w:p>
         </w:tc>
@@ -259,7 +259,7 @@
           </w:tcPr>
           <w:p>
             <w:r>
-              <w:t>89.0%</w:t>
+              <w:t>88.8%</w:t>
             </w:r>
           </w:p>
         </w:tc>
@@ -281,7 +281,7 @@
           </w:tcPr>
           <w:p>
             <w:r>
-              <w:t>391.97 GB / 1862.96 GB</w:t>
+              <w:t>391.98 GB / 1862.96 GB</w:t>
             </w:r>
           </w:p>
         </w:tc>
@@ -1137,7 +1137,7 @@
         <w:tab/>
         <w:t>github.com/soulchip/game/internal/game</w:t>
         <w:tab/>
-        <w:t>1.817s</w:t>
+        <w:t>0.674s</w:t>
         <w:br/>
       </w:r>
     </w:p>

</xml_diff>

<commit_message>
Create Story Writer team for narrative and dialogue design, integrating them into the daily docx report pipeline
</commit_message>
<xml_diff>
--- a/report/character_designer/25-07-2026.docx
+++ b/report/character_designer/25-07-2026.docx
@@ -42,7 +42,7 @@
         <w:t xml:space="preserve">Verification Date: </w:t>
       </w:r>
       <w:r>
-        <w:t>25-07-2026 00:18:28 (ICT - Asia/Bangkok)</w:t>
+        <w:t>25-07-2026 00:28:52 (ICT - Asia/Bangkok)</w:t>
         <w:br/>
       </w:r>
       <w:r>
@@ -227,7 +227,7 @@
           </w:tcPr>
           <w:p>
             <w:r>
-              <w:t>54.5%</w:t>
+              <w:t>23.3%</w:t>
             </w:r>
           </w:p>
         </w:tc>
@@ -249,7 +249,7 @@
           </w:tcPr>
           <w:p>
             <w:r>
-              <w:t>21.05 GB / 23.71 GB</w:t>
+              <w:t>20.81 GB / 23.71 GB</w:t>
             </w:r>
           </w:p>
         </w:tc>
@@ -259,7 +259,7 @@
           </w:tcPr>
           <w:p>
             <w:r>
-              <w:t>88.8%</w:t>
+              <w:t>87.7%</w:t>
             </w:r>
           </w:p>
         </w:tc>
@@ -1137,7 +1137,7 @@
         <w:tab/>
         <w:t>github.com/soulchip/game/internal/game</w:t>
         <w:tab/>
-        <w:t>0.674s</w:t>
+        <w:t>(cached)</w:t>
         <w:br/>
       </w:r>
     </w:p>

</xml_diff>